<commit_message>
brancher ut en forandring her
</commit_message>
<xml_diff>
--- a/docs/Arbeidskrav 2 - Daniela og hans.docx
+++ b/docs/Arbeidskrav 2 - Daniela og hans.docx
@@ -22,7 +22,7 @@
         <w:pStyle w:val="Heading1"/>
         <w:numPr>
           <w:ilvl w:val="0"/>
-          <w:numId w:val="1"/>
+          <w:numId w:val="2"/>
         </w:numPr>
         <w:bidi w:val="0"/>
         <w:ind w:hanging="0" w:start="0"/>
@@ -109,7 +109,7 @@
       </w:r>
       <w:r>
         <w:rPr/>
-        <w:t>Registrere nye produkter.   X</w:t>
+        <w:t xml:space="preserve">Registrere nye produkter.   </w:t>
       </w:r>
     </w:p>
     <w:p>
@@ -261,97 +261,174 @@
         </w:rPr>
       </w:pPr>
       <w:r>
-        <w:rPr/>
-        <w:t>Vi skal lage en web basert lagerløsning og i første omgang skal vi designe med funksjoner som fyller den ønskede funksjonaliteten.</w:t>
-      </w:r>
-    </w:p>
-    <w:p>
-      <w:pPr>
-        <w:pStyle w:val="Normal"/>
-        <w:bidi w:val="0"/>
-        <w:jc w:val="start"/>
-        <w:rPr>
-          <w:lang w:val="en-US"/>
-        </w:rPr>
-      </w:pPr>
-      <w:r>
-        <w:rPr>
-          <w:lang w:val="en-US"/>
-        </w:rPr>
-      </w:r>
-    </w:p>
-    <w:p>
-      <w:pPr>
-        <w:pStyle w:val="Normal"/>
-        <w:bidi w:val="0"/>
-        <w:jc w:val="start"/>
-        <w:rPr>
-          <w:lang w:val="en-US"/>
-        </w:rPr>
-      </w:pPr>
-      <w:r>
-        <w:rPr/>
-        <w:t>Vi skal bruke fastAPI til å serve statiske websider, og innhold hentes fra database som fastapi kjører. Vi vil bruke sqlite for enkelhets skyld, men det kan like gjerne være en mysql eller mssql database dersom man skriver om connect metoden.</w:t>
-        <w:tab/>
-        <w:t xml:space="preserve"> (Eventuelt en docker compose stack med både applikasjon og databaseserver).</w:t>
-      </w:r>
-    </w:p>
-    <w:p>
-      <w:pPr>
-        <w:pStyle w:val="Normal"/>
-        <w:bidi w:val="0"/>
-        <w:jc w:val="start"/>
-        <w:rPr>
-          <w:lang w:val="en-US"/>
-        </w:rPr>
-      </w:pPr>
-      <w:r>
-        <w:rPr>
-          <w:lang w:val="en-US"/>
-        </w:rPr>
-      </w:r>
-    </w:p>
-    <w:p>
-      <w:pPr>
-        <w:pStyle w:val="Normal"/>
-        <w:bidi w:val="0"/>
-        <w:jc w:val="start"/>
-        <w:rPr>
-          <w:lang w:val="en-US"/>
-        </w:rPr>
-      </w:pPr>
-      <w:r>
-        <w:rPr/>
-        <w:t>Vi lager en database med I utgangspunktet to tabeller, litt forenklet men greit siden de skal inneholde de elementene vi har hatt noe om.  Primærnøkkel og relasjoner datatyper osv.</w:t>
-      </w:r>
-    </w:p>
-    <w:p>
-      <w:pPr>
-        <w:pStyle w:val="Normal"/>
-        <w:bidi w:val="0"/>
-        <w:jc w:val="start"/>
-        <w:rPr>
-          <w:lang w:val="en-US"/>
-        </w:rPr>
-      </w:pPr>
-      <w:r>
-        <w:rPr>
-          <w:lang w:val="en-US"/>
-        </w:rPr>
-      </w:r>
-    </w:p>
-    <w:p>
-      <w:pPr>
-        <w:pStyle w:val="Normal"/>
-        <w:bidi w:val="0"/>
-        <w:jc w:val="start"/>
-        <w:rPr>
-          <w:lang w:val="en-US"/>
-        </w:rPr>
-      </w:pPr>
-      <w:r>
-        <w:rPr/>
-        <w:t>En Varetabell og en Kategori tabell. En kategori indikeres I varetabellen som et tall. Som linkes til en kategori I kategori tabellen. Koster mindre å søke etter en integer enn en str I en database.</w:t>
+        <w:rPr>
+          <w:lang w:val="en-US"/>
+        </w:rPr>
+      </w:r>
+    </w:p>
+    <w:p>
+      <w:pPr>
+        <w:pStyle w:val="Normal"/>
+        <w:bidi w:val="0"/>
+        <w:jc w:val="start"/>
+        <w:rPr>
+          <w:lang w:val="en-US"/>
+        </w:rPr>
+      </w:pPr>
+      <w:r>
+        <w:rPr>
+          <w:lang w:val="en-US"/>
+        </w:rPr>
+      </w:r>
+    </w:p>
+    <w:p>
+      <w:pPr>
+        <w:pStyle w:val="Heading2"/>
+        <w:ind w:hanging="0" w:start="0"/>
+        <w:rPr/>
+      </w:pPr>
+      <w:r>
+        <w:rPr/>
+        <w:t xml:space="preserve">Hva skal vi lage </w:t>
+      </w:r>
+    </w:p>
+    <w:p>
+      <w:pPr>
+        <w:pStyle w:val="BodyText"/>
+        <w:rPr/>
+      </w:pPr>
+      <w:r>
+        <w:rPr/>
+      </w:r>
+    </w:p>
+    <w:p>
+      <w:pPr>
+        <w:pStyle w:val="Normal"/>
+        <w:bidi w:val="0"/>
+        <w:jc w:val="start"/>
+        <w:rPr>
+          <w:lang w:val="en-US"/>
+        </w:rPr>
+      </w:pPr>
+      <w:r>
+        <w:rPr/>
+        <w:t>Vi skal lage en web basert lagerløsning, og i første omgang skal vi designe med funksjoner som fyller den ønskede funksjonaliteten.</w:t>
+      </w:r>
+    </w:p>
+    <w:p>
+      <w:pPr>
+        <w:pStyle w:val="Normal"/>
+        <w:bidi w:val="0"/>
+        <w:jc w:val="start"/>
+        <w:rPr>
+          <w:lang w:val="en-US"/>
+        </w:rPr>
+      </w:pPr>
+      <w:r>
+        <w:rPr>
+          <w:lang w:val="en-US"/>
+        </w:rPr>
+      </w:r>
+    </w:p>
+    <w:p>
+      <w:pPr>
+        <w:pStyle w:val="Normal"/>
+        <w:bidi w:val="0"/>
+        <w:jc w:val="start"/>
+        <w:rPr>
+          <w:lang w:val="en-US"/>
+        </w:rPr>
+      </w:pPr>
+      <w:r>
+        <w:rPr/>
+        <w:t xml:space="preserve">Vi skal bruke fastAPI til å serve statiske websider, og innhold hentes fra database som fastapi kjører. Vi vil bruke sqlite for enkelhets skyld, men det kan like gjerne være en mysql eller mssql database dersom man skriver om connect metoden. Eventuelt en docker compose stack med både applikasjon og databaseserver. </w:t>
+      </w:r>
+      <w:r>
+        <w:rPr>
+          <w:lang w:val="nb-NO"/>
+        </w:rPr>
+        <w:t>Nå</w:t>
+      </w:r>
+      <w:r>
+        <w:rPr/>
+        <w:t xml:space="preserve"> </w:t>
+      </w:r>
+      <w:r>
+        <w:rPr>
+          <w:lang w:val="nb-NO"/>
+        </w:rPr>
+        <w:t>vil</w:t>
+      </w:r>
+      <w:r>
+        <w:rPr/>
+        <w:t xml:space="preserve"> vi levere på git, docker og </w:t>
+      </w:r>
+      <w:r>
+        <w:rPr/>
+        <w:t>i</w:t>
+      </w:r>
+      <w:r>
+        <w:rPr/>
+        <w:t xml:space="preserve"> en zipfil. </w:t>
+      </w:r>
+    </w:p>
+    <w:p>
+      <w:pPr>
+        <w:pStyle w:val="Normal"/>
+        <w:bidi w:val="0"/>
+        <w:jc w:val="start"/>
+        <w:rPr>
+          <w:lang w:val="en-US"/>
+        </w:rPr>
+      </w:pPr>
+      <w:r>
+        <w:rPr>
+          <w:lang w:val="en-US"/>
+        </w:rPr>
+      </w:r>
+    </w:p>
+    <w:p>
+      <w:pPr>
+        <w:pStyle w:val="Normal"/>
+        <w:bidi w:val="0"/>
+        <w:jc w:val="start"/>
+        <w:rPr>
+          <w:lang w:val="en-US"/>
+        </w:rPr>
+      </w:pPr>
+      <w:r>
+        <w:rPr/>
+        <w:t>Vi lager en database med to tabeller, litt forenklet men greit siden de skal inneholde de elementene vi har hatt noe om. Primærnøkkel og relasjoner, datatyper.</w:t>
+      </w:r>
+    </w:p>
+    <w:p>
+      <w:pPr>
+        <w:pStyle w:val="Normal"/>
+        <w:bidi w:val="0"/>
+        <w:jc w:val="start"/>
+        <w:rPr>
+          <w:lang w:val="en-US"/>
+        </w:rPr>
+      </w:pPr>
+      <w:r>
+        <w:rPr/>
+        <w:t xml:space="preserve">En Varetabell og en Kategori tabell. En kategori indikeres </w:t>
+      </w:r>
+      <w:r>
+        <w:rPr/>
+        <w:t>i</w:t>
+      </w:r>
+      <w:r>
+        <w:rPr/>
+        <w:t xml:space="preserve"> varetabellen som et tall. Som linkes til en kategori I kategori tabellen. Koster mindre å søke etter en integer enn en str </w:t>
+      </w:r>
+      <w:r>
+        <w:rPr/>
+        <w:t>i</w:t>
+      </w:r>
+      <w:r>
+        <w:rPr/>
+        <w:t xml:space="preserve"> en database.</w:t>
       </w:r>
     </w:p>
     <w:p>
@@ -393,6 +470,67 @@
         </w:rPr>
       </w:pPr>
       <w:r>
+        <w:rPr>
+          <w:lang w:val="en-US"/>
+        </w:rPr>
+        <w:t>Vi skal ha en database.py fil som inneholder alle funksjoner som kommuniserer med databasen. Vi importerer disse til main.py, og lar fastapi rutene kjøre disse med riktige parametre og objekter.</w:t>
+      </w:r>
+    </w:p>
+    <w:p>
+      <w:pPr>
+        <w:pStyle w:val="Normal"/>
+        <w:bidi w:val="0"/>
+        <w:jc w:val="start"/>
+        <w:rPr>
+          <w:lang w:val="en-US"/>
+        </w:rPr>
+      </w:pPr>
+      <w:r>
+        <w:rPr>
+          <w:lang w:val="en-US"/>
+        </w:rPr>
+      </w:r>
+    </w:p>
+    <w:p>
+      <w:pPr>
+        <w:pStyle w:val="Normal"/>
+        <w:bidi w:val="0"/>
+        <w:jc w:val="start"/>
+        <w:rPr>
+          <w:lang w:val="en-US"/>
+        </w:rPr>
+      </w:pPr>
+      <w:r>
+        <w:rPr>
+          <w:lang w:val="en-US"/>
+        </w:rPr>
+      </w:r>
+    </w:p>
+    <w:p>
+      <w:pPr>
+        <w:pStyle w:val="Normal"/>
+        <w:bidi w:val="0"/>
+        <w:jc w:val="start"/>
+        <w:rPr>
+          <w:lang w:val="en-US"/>
+        </w:rPr>
+      </w:pPr>
+      <w:r>
+        <w:rPr>
+          <w:lang w:val="en-US"/>
+        </w:rPr>
+      </w:r>
+    </w:p>
+    <w:p>
+      <w:pPr>
+        <w:pStyle w:val="Normal"/>
+        <w:bidi w:val="0"/>
+        <w:jc w:val="start"/>
+        <w:rPr>
+          <w:lang w:val="en-US"/>
+        </w:rPr>
+      </w:pPr>
+      <w:r>
         <w:rPr/>
         <w:t xml:space="preserve"> </w:t>
       </w:r>
@@ -455,6 +593,24 @@
         <w:rPr>
           <w:lang w:val="en-US"/>
         </w:rPr>
+      </w:r>
+    </w:p>
+    <w:p>
+      <w:pPr>
+        <w:pStyle w:val="Normal"/>
+        <w:bidi w:val="0"/>
+        <w:jc w:val="start"/>
+        <w:rPr>
+          <w:lang w:val="en-US"/>
+        </w:rPr>
+      </w:pPr>
+      <w:r>
+        <w:rPr>
+          <w:lang w:val="en-US"/>
+        </w:rPr>
+      </w:r>
+      <w:r>
+        <w:br w:type="page"/>
       </w:r>
     </w:p>
     <w:p>
@@ -492,127 +648,119 @@
       <w:start w:val="1"/>
       <w:numFmt w:val="none"/>
       <w:suff w:val="nothing"/>
-      <w:lvlText w:val="%1"/>
-      <w:lvlJc w:val="start"/>
-      <w:pPr>
-        <w:tabs>
-          <w:tab w:val="num" w:pos="0"/>
-        </w:tabs>
-        <w:ind w:start="0" w:hanging="0"/>
-      </w:pPr>
-      <w:rPr/>
+      <w:lvlText w:val=""/>
+      <w:lvlJc w:val="start"/>
+      <w:pPr>
+        <w:tabs>
+          <w:tab w:val="num" w:pos="0"/>
+        </w:tabs>
+        <w:ind w:start="0" w:hanging="0"/>
+      </w:pPr>
     </w:lvl>
     <w:lvl w:ilvl="1">
       <w:start w:val="1"/>
       <w:numFmt w:val="none"/>
-      <w:suff w:val="nothing"/>
-      <w:lvlText w:val="%2"/>
-      <w:lvlJc w:val="start"/>
-      <w:pPr>
-        <w:tabs>
-          <w:tab w:val="num" w:pos="0"/>
-        </w:tabs>
-        <w:ind w:start="0" w:hanging="0"/>
-      </w:pPr>
-      <w:rPr/>
+      <w:pStyle w:val="Heading2"/>
+      <w:suff w:val="nothing"/>
+      <w:lvlText w:val=""/>
+      <w:lvlJc w:val="start"/>
+      <w:pPr>
+        <w:tabs>
+          <w:tab w:val="num" w:pos="0"/>
+        </w:tabs>
+        <w:ind w:start="0" w:hanging="0"/>
+      </w:pPr>
     </w:lvl>
     <w:lvl w:ilvl="2">
       <w:start w:val="1"/>
       <w:numFmt w:val="none"/>
       <w:suff w:val="nothing"/>
-      <w:lvlText w:val="%3"/>
-      <w:lvlJc w:val="start"/>
-      <w:pPr>
-        <w:tabs>
-          <w:tab w:val="num" w:pos="0"/>
-        </w:tabs>
-        <w:ind w:start="0" w:hanging="0"/>
-      </w:pPr>
-      <w:rPr/>
+      <w:lvlText w:val=""/>
+      <w:lvlJc w:val="start"/>
+      <w:pPr>
+        <w:tabs>
+          <w:tab w:val="num" w:pos="0"/>
+        </w:tabs>
+        <w:ind w:start="0" w:hanging="0"/>
+      </w:pPr>
     </w:lvl>
     <w:lvl w:ilvl="3">
       <w:start w:val="1"/>
       <w:numFmt w:val="none"/>
       <w:suff w:val="nothing"/>
-      <w:lvlText w:val="%4"/>
-      <w:lvlJc w:val="start"/>
-      <w:pPr>
-        <w:tabs>
-          <w:tab w:val="num" w:pos="0"/>
-        </w:tabs>
-        <w:ind w:start="0" w:hanging="0"/>
-      </w:pPr>
-      <w:rPr/>
+      <w:lvlText w:val=""/>
+      <w:lvlJc w:val="start"/>
+      <w:pPr>
+        <w:tabs>
+          <w:tab w:val="num" w:pos="0"/>
+        </w:tabs>
+        <w:ind w:start="0" w:hanging="0"/>
+      </w:pPr>
     </w:lvl>
     <w:lvl w:ilvl="4">
       <w:start w:val="1"/>
       <w:numFmt w:val="none"/>
       <w:suff w:val="nothing"/>
-      <w:lvlText w:val="%5"/>
-      <w:lvlJc w:val="start"/>
-      <w:pPr>
-        <w:tabs>
-          <w:tab w:val="num" w:pos="0"/>
-        </w:tabs>
-        <w:ind w:start="0" w:hanging="0"/>
-      </w:pPr>
-      <w:rPr/>
+      <w:lvlText w:val=""/>
+      <w:lvlJc w:val="start"/>
+      <w:pPr>
+        <w:tabs>
+          <w:tab w:val="num" w:pos="0"/>
+        </w:tabs>
+        <w:ind w:start="0" w:hanging="0"/>
+      </w:pPr>
     </w:lvl>
     <w:lvl w:ilvl="5">
       <w:start w:val="1"/>
       <w:numFmt w:val="none"/>
       <w:suff w:val="nothing"/>
-      <w:lvlText w:val="%6"/>
-      <w:lvlJc w:val="start"/>
-      <w:pPr>
-        <w:tabs>
-          <w:tab w:val="num" w:pos="0"/>
-        </w:tabs>
-        <w:ind w:start="0" w:hanging="0"/>
-      </w:pPr>
-      <w:rPr/>
+      <w:lvlText w:val=""/>
+      <w:lvlJc w:val="start"/>
+      <w:pPr>
+        <w:tabs>
+          <w:tab w:val="num" w:pos="0"/>
+        </w:tabs>
+        <w:ind w:start="0" w:hanging="0"/>
+      </w:pPr>
     </w:lvl>
     <w:lvl w:ilvl="6">
       <w:start w:val="1"/>
       <w:numFmt w:val="none"/>
       <w:suff w:val="nothing"/>
-      <w:lvlText w:val="%7"/>
-      <w:lvlJc w:val="start"/>
-      <w:pPr>
-        <w:tabs>
-          <w:tab w:val="num" w:pos="0"/>
-        </w:tabs>
-        <w:ind w:start="0" w:hanging="0"/>
-      </w:pPr>
-      <w:rPr/>
+      <w:lvlText w:val=""/>
+      <w:lvlJc w:val="start"/>
+      <w:pPr>
+        <w:tabs>
+          <w:tab w:val="num" w:pos="0"/>
+        </w:tabs>
+        <w:ind w:start="0" w:hanging="0"/>
+      </w:pPr>
     </w:lvl>
     <w:lvl w:ilvl="7">
       <w:start w:val="1"/>
       <w:numFmt w:val="none"/>
       <w:suff w:val="nothing"/>
-      <w:lvlText w:val="%8"/>
-      <w:lvlJc w:val="start"/>
-      <w:pPr>
-        <w:tabs>
-          <w:tab w:val="num" w:pos="0"/>
-        </w:tabs>
-        <w:ind w:start="0" w:hanging="0"/>
-      </w:pPr>
-      <w:rPr/>
+      <w:lvlText w:val=""/>
+      <w:lvlJc w:val="start"/>
+      <w:pPr>
+        <w:tabs>
+          <w:tab w:val="num" w:pos="0"/>
+        </w:tabs>
+        <w:ind w:start="0" w:hanging="0"/>
+      </w:pPr>
     </w:lvl>
     <w:lvl w:ilvl="8">
       <w:start w:val="1"/>
       <w:numFmt w:val="none"/>
       <w:suff w:val="nothing"/>
-      <w:lvlText w:val="%9"/>
-      <w:lvlJc w:val="start"/>
-      <w:pPr>
-        <w:tabs>
-          <w:tab w:val="num" w:pos="0"/>
-        </w:tabs>
-        <w:ind w:start="0" w:hanging="0"/>
-      </w:pPr>
-      <w:rPr/>
+      <w:lvlText w:val=""/>
+      <w:lvlJc w:val="start"/>
+      <w:pPr>
+        <w:tabs>
+          <w:tab w:val="num" w:pos="0"/>
+        </w:tabs>
+        <w:ind w:start="0" w:hanging="0"/>
+      </w:pPr>
     </w:lvl>
   </w:abstractNum>
   <w:abstractNum w:abstractNumId="2">
@@ -620,118 +768,127 @@
       <w:start w:val="1"/>
       <w:numFmt w:val="none"/>
       <w:suff w:val="nothing"/>
-      <w:lvlText w:val=""/>
-      <w:lvlJc w:val="start"/>
-      <w:pPr>
-        <w:tabs>
-          <w:tab w:val="num" w:pos="0"/>
-        </w:tabs>
-        <w:ind w:start="0" w:hanging="0"/>
-      </w:pPr>
+      <w:lvlText w:val="%1"/>
+      <w:lvlJc w:val="start"/>
+      <w:pPr>
+        <w:tabs>
+          <w:tab w:val="num" w:pos="0"/>
+        </w:tabs>
+        <w:ind w:start="0" w:hanging="0"/>
+      </w:pPr>
+      <w:rPr/>
     </w:lvl>
     <w:lvl w:ilvl="1">
       <w:start w:val="1"/>
       <w:numFmt w:val="none"/>
       <w:suff w:val="nothing"/>
-      <w:lvlText w:val=""/>
-      <w:lvlJc w:val="start"/>
-      <w:pPr>
-        <w:tabs>
-          <w:tab w:val="num" w:pos="0"/>
-        </w:tabs>
-        <w:ind w:start="0" w:hanging="0"/>
-      </w:pPr>
+      <w:lvlText w:val="%2"/>
+      <w:lvlJc w:val="start"/>
+      <w:pPr>
+        <w:tabs>
+          <w:tab w:val="num" w:pos="0"/>
+        </w:tabs>
+        <w:ind w:start="0" w:hanging="0"/>
+      </w:pPr>
+      <w:rPr/>
     </w:lvl>
     <w:lvl w:ilvl="2">
       <w:start w:val="1"/>
       <w:numFmt w:val="none"/>
       <w:suff w:val="nothing"/>
-      <w:lvlText w:val=""/>
-      <w:lvlJc w:val="start"/>
-      <w:pPr>
-        <w:tabs>
-          <w:tab w:val="num" w:pos="0"/>
-        </w:tabs>
-        <w:ind w:start="0" w:hanging="0"/>
-      </w:pPr>
+      <w:lvlText w:val="%3"/>
+      <w:lvlJc w:val="start"/>
+      <w:pPr>
+        <w:tabs>
+          <w:tab w:val="num" w:pos="0"/>
+        </w:tabs>
+        <w:ind w:start="0" w:hanging="0"/>
+      </w:pPr>
+      <w:rPr/>
     </w:lvl>
     <w:lvl w:ilvl="3">
       <w:start w:val="1"/>
       <w:numFmt w:val="none"/>
       <w:suff w:val="nothing"/>
-      <w:lvlText w:val=""/>
-      <w:lvlJc w:val="start"/>
-      <w:pPr>
-        <w:tabs>
-          <w:tab w:val="num" w:pos="0"/>
-        </w:tabs>
-        <w:ind w:start="0" w:hanging="0"/>
-      </w:pPr>
+      <w:lvlText w:val="%4"/>
+      <w:lvlJc w:val="start"/>
+      <w:pPr>
+        <w:tabs>
+          <w:tab w:val="num" w:pos="0"/>
+        </w:tabs>
+        <w:ind w:start="0" w:hanging="0"/>
+      </w:pPr>
+      <w:rPr/>
     </w:lvl>
     <w:lvl w:ilvl="4">
       <w:start w:val="1"/>
       <w:numFmt w:val="none"/>
       <w:suff w:val="nothing"/>
-      <w:lvlText w:val=""/>
-      <w:lvlJc w:val="start"/>
-      <w:pPr>
-        <w:tabs>
-          <w:tab w:val="num" w:pos="0"/>
-        </w:tabs>
-        <w:ind w:start="0" w:hanging="0"/>
-      </w:pPr>
+      <w:lvlText w:val="%5"/>
+      <w:lvlJc w:val="start"/>
+      <w:pPr>
+        <w:tabs>
+          <w:tab w:val="num" w:pos="0"/>
+        </w:tabs>
+        <w:ind w:start="0" w:hanging="0"/>
+      </w:pPr>
+      <w:rPr/>
     </w:lvl>
     <w:lvl w:ilvl="5">
       <w:start w:val="1"/>
       <w:numFmt w:val="none"/>
       <w:suff w:val="nothing"/>
-      <w:lvlText w:val=""/>
-      <w:lvlJc w:val="start"/>
-      <w:pPr>
-        <w:tabs>
-          <w:tab w:val="num" w:pos="0"/>
-        </w:tabs>
-        <w:ind w:start="0" w:hanging="0"/>
-      </w:pPr>
+      <w:lvlText w:val="%6"/>
+      <w:lvlJc w:val="start"/>
+      <w:pPr>
+        <w:tabs>
+          <w:tab w:val="num" w:pos="0"/>
+        </w:tabs>
+        <w:ind w:start="0" w:hanging="0"/>
+      </w:pPr>
+      <w:rPr/>
     </w:lvl>
     <w:lvl w:ilvl="6">
       <w:start w:val="1"/>
       <w:numFmt w:val="none"/>
       <w:suff w:val="nothing"/>
-      <w:lvlText w:val=""/>
-      <w:lvlJc w:val="start"/>
-      <w:pPr>
-        <w:tabs>
-          <w:tab w:val="num" w:pos="0"/>
-        </w:tabs>
-        <w:ind w:start="0" w:hanging="0"/>
-      </w:pPr>
+      <w:lvlText w:val="%7"/>
+      <w:lvlJc w:val="start"/>
+      <w:pPr>
+        <w:tabs>
+          <w:tab w:val="num" w:pos="0"/>
+        </w:tabs>
+        <w:ind w:start="0" w:hanging="0"/>
+      </w:pPr>
+      <w:rPr/>
     </w:lvl>
     <w:lvl w:ilvl="7">
       <w:start w:val="1"/>
       <w:numFmt w:val="none"/>
       <w:suff w:val="nothing"/>
-      <w:lvlText w:val=""/>
-      <w:lvlJc w:val="start"/>
-      <w:pPr>
-        <w:tabs>
-          <w:tab w:val="num" w:pos="0"/>
-        </w:tabs>
-        <w:ind w:start="0" w:hanging="0"/>
-      </w:pPr>
+      <w:lvlText w:val="%8"/>
+      <w:lvlJc w:val="start"/>
+      <w:pPr>
+        <w:tabs>
+          <w:tab w:val="num" w:pos="0"/>
+        </w:tabs>
+        <w:ind w:start="0" w:hanging="0"/>
+      </w:pPr>
+      <w:rPr/>
     </w:lvl>
     <w:lvl w:ilvl="8">
       <w:start w:val="1"/>
       <w:numFmt w:val="none"/>
       <w:suff w:val="nothing"/>
-      <w:lvlText w:val=""/>
-      <w:lvlJc w:val="start"/>
-      <w:pPr>
-        <w:tabs>
-          <w:tab w:val="num" w:pos="0"/>
-        </w:tabs>
-        <w:ind w:start="0" w:hanging="0"/>
-      </w:pPr>
+      <w:lvlText w:val="%9"/>
+      <w:lvlJc w:val="start"/>
+      <w:pPr>
+        <w:tabs>
+          <w:tab w:val="num" w:pos="0"/>
+        </w:tabs>
+        <w:ind w:start="0" w:hanging="0"/>
+      </w:pPr>
+      <w:rPr/>
     </w:lvl>
   </w:abstractNum>
   <w:num w:numId="1">
@@ -767,7 +924,7 @@
     <w:pPr>
       <w:widowControl/>
       <w:suppressAutoHyphens w:val="true"/>
-      <w:overflowPunct w:val="true"/>
+      <w:overflowPunct w:val="false"/>
       <w:bidi w:val="0"/>
       <w:spacing w:before="0" w:after="0"/>
       <w:jc w:val="start"/>
@@ -789,7 +946,7 @@
     <w:pPr>
       <w:numPr>
         <w:ilvl w:val="0"/>
-        <w:numId w:val="1"/>
+        <w:numId w:val="2"/>
       </w:numPr>
       <w:spacing w:before="240" w:after="120"/>
       <w:outlineLvl w:val="0"/>
@@ -799,6 +956,26 @@
       <w:bCs/>
       <w:sz w:val="36"/>
       <w:szCs w:val="36"/>
+    </w:rPr>
+  </w:style>
+  <w:style w:type="paragraph" w:styleId="Heading2">
+    <w:name w:val="heading 2"/>
+    <w:basedOn w:val="Heading"/>
+    <w:next w:val="BodyText"/>
+    <w:qFormat/>
+    <w:pPr>
+      <w:numPr>
+        <w:ilvl w:val="1"/>
+        <w:numId w:val="1"/>
+      </w:numPr>
+      <w:spacing w:before="200" w:after="120"/>
+      <w:outlineLvl w:val="1"/>
+    </w:pPr>
+    <w:rPr>
+      <w:b/>
+      <w:bCs/>
+      <w:sz w:val="32"/>
+      <w:szCs w:val="32"/>
     </w:rPr>
   </w:style>
   <w:style w:type="paragraph" w:styleId="Heading">

</xml_diff>